<commit_message>
Documento de Projeto de Extensão
Versão atualizada do projeto de extensão
</commit_message>
<xml_diff>
--- a/documentos/Entrega 2/Projeto Interdisciplinar/Documento - Projeto de Extensão - COM Empresa - 2026_1.docx
+++ b/documentos/Entrega 2/Projeto Interdisciplinar/Documento - Projeto de Extensão - COM Empresa - 2026_1.docx
@@ -405,15 +405,7 @@
                 <w:sz w:val="24"/>
                 <w:szCs w:val="24"/>
               </w:rPr>
-              <w:t>C</w:t>
-            </w:r>
-            <w:r>
-              <w:rPr>
-                <w:rFonts w:ascii="Arial" w:eastAsia="Arial" w:hAnsi="Arial" w:cs="Arial"/>
-                <w:sz w:val="24"/>
-                <w:szCs w:val="24"/>
-              </w:rPr>
-              <w:t>aio Fábio Freitas</w:t>
+              <w:t>Caio Fábio Freitas</w:t>
             </w:r>
           </w:p>
           <w:p>
@@ -676,6 +668,7 @@
           <w:sz w:val="24"/>
           <w:szCs w:val="24"/>
         </w:rPr>
+        <w:lastRenderedPageBreak/>
         <w:t>Professor</w:t>
       </w:r>
       <w:r>
@@ -777,15 +770,7 @@
                 <w:sz w:val="24"/>
                 <w:szCs w:val="24"/>
               </w:rPr>
-              <w:t>David de Oliveira Lemes</w:t>
-            </w:r>
-            <w:r>
-              <w:rPr>
-                <w:rFonts w:ascii="Arial" w:hAnsi="Arial" w:cs="Arial"/>
-                <w:sz w:val="24"/>
-                <w:szCs w:val="24"/>
-              </w:rPr>
-              <w:t>,</w:t>
+              <w:t>David de Oliveira Lemes,</w:t>
             </w:r>
             <w:r>
               <w:rPr>
@@ -817,23 +802,7 @@
                 <w:sz w:val="24"/>
                 <w:szCs w:val="24"/>
               </w:rPr>
-              <w:t xml:space="preserve">Pires, </w:t>
-            </w:r>
-            <w:r>
-              <w:rPr>
-                <w:rFonts w:ascii="Arial" w:hAnsi="Arial" w:cs="Arial"/>
-                <w:sz w:val="24"/>
-                <w:szCs w:val="24"/>
-              </w:rPr>
-              <w:t>Renata Muniz do Nascimento</w:t>
-            </w:r>
-            <w:r>
-              <w:rPr>
-                <w:rFonts w:ascii="Arial" w:hAnsi="Arial" w:cs="Arial"/>
-                <w:sz w:val="24"/>
-                <w:szCs w:val="24"/>
-              </w:rPr>
-              <w:t xml:space="preserve">, </w:t>
+              <w:t xml:space="preserve">Pires, Renata Muniz do Nascimento, </w:t>
             </w:r>
             <w:r>
               <w:rPr>
@@ -1418,7 +1387,14 @@
               <w:rPr>
                 <w:rFonts w:ascii="Arial" w:hAnsi="Arial" w:cs="Arial"/>
               </w:rPr>
-              <w:t>com o objetivo de promover conscientização social por meio da gamificação. O projeto foi motivado pela necessidade de representar, de forma interativa, os desafios enfrentados por agentes de segurança ao tentar conter criminosos sem causar danos à cidade e à população.</w:t>
+              <w:t xml:space="preserve">com o objetivo de promover conscientização social por meio da gamificação. O projeto foi motivado pela necessidade de representar, de forma interativa, os desafios enfrentados por </w:t>
+            </w:r>
+            <w:r>
+              <w:rPr>
+                <w:rFonts w:ascii="Arial" w:hAnsi="Arial" w:cs="Arial"/>
+              </w:rPr>
+              <w:lastRenderedPageBreak/>
+              <w:t>agentes de segurança ao tentar conter criminosos sem causar danos à cidade e à população.</w:t>
             </w:r>
           </w:p>
           <w:p>
@@ -1661,6 +1637,7 @@
           <w:sz w:val="24"/>
           <w:szCs w:val="24"/>
         </w:rPr>
+        <w:lastRenderedPageBreak/>
         <w:t xml:space="preserve">Produto decorrente do projeto </w:t>
       </w:r>
     </w:p>
@@ -1919,6 +1896,7 @@
                 <w:b/>
                 <w:bCs/>
               </w:rPr>
+              <w:lastRenderedPageBreak/>
               <w:t>Figura 3:</w:t>
             </w:r>
             <w:r>
@@ -2125,6 +2103,7 @@
           <w:sz w:val="24"/>
           <w:szCs w:val="24"/>
         </w:rPr>
+        <w:lastRenderedPageBreak/>
         <w:t>2. IDENTIFICAÇÃO DO CENÁRIO DE INTERVENÇÃO E HIPÓTESES DE SOLUÇÃO</w:t>
       </w:r>
     </w:p>
@@ -2490,6 +2469,7 @@
           <w:sz w:val="24"/>
           <w:szCs w:val="24"/>
         </w:rPr>
+        <w:lastRenderedPageBreak/>
         <w:t>Apresentação do(s) problema(s) observado(s) e delimitação do objeto de estudo e intervenção</w:t>
       </w:r>
     </w:p>
@@ -2822,15 +2802,7 @@
                 <w:sz w:val="24"/>
                 <w:szCs w:val="24"/>
               </w:rPr>
-              <w:t>Com base nisso, o processo utilizado para garantir a</w:t>
-            </w:r>
-            <w:r>
-              <w:rPr>
-                <w:rFonts w:ascii="Arial" w:eastAsia="Arial" w:hAnsi="Arial" w:cs="Arial"/>
-                <w:sz w:val="24"/>
-                <w:szCs w:val="24"/>
-              </w:rPr>
-              <w:t xml:space="preserve"> integridade ética do jogo é o uso do GitHub para controle de versão com práticas as quais evitam a exposição de chaves de API ou dados sensíveis nos repositórios públicos, visto que, relatórios recentes apontam crescimento expressivo de incidentes de vazamento: um levantamento citado pelo MIT indica aumento de 493% nos vazamentos de dados no Brasil em determinados períodos recentes. </w:t>
+              <w:t xml:space="preserve">Com base nisso, o processo utilizado para garantir a integridade ética do jogo é o uso do GitHub para controle de versão com práticas as quais evitam a exposição de chaves de API ou dados sensíveis nos repositórios públicos, visto que, relatórios recentes apontam crescimento expressivo de incidentes de vazamento: um levantamento citado pelo MIT indica aumento de 493% nos vazamentos de dados no Brasil em determinados períodos recentes. </w:t>
             </w:r>
           </w:p>
           <w:p>
@@ -2859,7 +2831,7 @@
                 <w14:ligatures w14:val="standardContextual"/>
               </w:rPr>
               <w:drawing>
-                <wp:inline distT="0" distB="0" distL="0" distR="0" wp14:anchorId="2FF2647C" wp14:editId="6FCBE6D4">
+                <wp:inline distT="0" distB="0" distL="0" distR="0" wp14:anchorId="2FF2647C" wp14:editId="09B28570">
                   <wp:extent cx="4829175" cy="3209925"/>
                   <wp:effectExtent l="0" t="0" r="9525" b="9525"/>
                   <wp:docPr id="9" name="Imagem 9" descr="Gráfico&#10;&#10;O conteúdo gerado por IA pode estar incorreto."/>
@@ -2924,6 +2896,7 @@
                 <w:sz w:val="24"/>
                 <w:szCs w:val="24"/>
               </w:rPr>
+              <w:lastRenderedPageBreak/>
               <w:t>Outro fator crucial é a equidade. A Pesquisa Game Brasil 2025 mostrou que pessoas de menor renda jogam principalmente no celular, e consoles e PCs gamer continuam concentrados nas classes mais altas.</w:t>
             </w:r>
           </w:p>
@@ -2953,7 +2926,7 @@
                 <w14:ligatures w14:val="standardContextual"/>
               </w:rPr>
               <w:drawing>
-                <wp:inline distT="0" distB="0" distL="0" distR="0" wp14:anchorId="0D4E1FB3" wp14:editId="0CC862C4">
+                <wp:inline distT="0" distB="0" distL="0" distR="0" wp14:anchorId="0D4E1FB3" wp14:editId="159ED733">
                   <wp:extent cx="5768340" cy="3499485"/>
                   <wp:effectExtent l="0" t="0" r="3810" b="5715"/>
                   <wp:docPr id="10" name="Imagem 10" descr="Gráfico, Gráfico de barras&#10;&#10;O conteúdo gerado por IA pode estar incorreto."/>
@@ -3018,15 +2991,7 @@
                 <w:sz w:val="24"/>
                 <w:szCs w:val="24"/>
               </w:rPr>
-              <w:t xml:space="preserve">Ademais, </w:t>
-            </w:r>
-            <w:r>
-              <w:rPr>
-                <w:rFonts w:ascii="Arial" w:eastAsia="Arial" w:hAnsi="Arial" w:cs="Arial"/>
-                <w:sz w:val="24"/>
-                <w:szCs w:val="24"/>
-              </w:rPr>
-              <w:t>numa realidade de 14,4 milhões de pessoas com deficiência no Brasil, o Urban Chase busca integrar recursos que permitam que qualquer pessoa, independentemente de suas limitações físicas, possa controlar os personagens, devido ao compromisso ético que o jogo visa utilizar e também implementar no pensamento dos players.</w:t>
+              <w:t>Ademais, numa realidade de 14,4 milhões de pessoas com deficiência no Brasil, o Urban Chase busca integrar recursos que permitam que qualquer pessoa, independentemente de suas limitações físicas, possa controlar os personagens, devido ao compromisso ético que o jogo visa utilizar e também implementar no pensamento dos players.</w:t>
             </w:r>
           </w:p>
           <w:p>
@@ -3118,6 +3083,7 @@
           <w:sz w:val="24"/>
           <w:szCs w:val="24"/>
         </w:rPr>
+        <w:lastRenderedPageBreak/>
         <w:t>Definição de hipóteses para a solução do problema observado</w:t>
       </w:r>
     </w:p>
@@ -3629,6 +3595,7 @@
           <w:sz w:val="24"/>
           <w:szCs w:val="24"/>
         </w:rPr>
+        <w:lastRenderedPageBreak/>
         <w:t>3 DESCRIÇÃO DO PROJETO</w:t>
       </w:r>
     </w:p>
@@ -3882,10 +3849,10 @@
           <w:tcPr>
             <w:tcW w:w="9300" w:type="dxa"/>
             <w:tcBorders>
-              <w:top w:val="single" w:sz="4" w:space="0" w:color="000000"/>
-              <w:left w:val="single" w:sz="4" w:space="0" w:color="000000"/>
-              <w:bottom w:val="single" w:sz="4" w:space="0" w:color="000000"/>
-              <w:right w:val="single" w:sz="4" w:space="0" w:color="000000"/>
+              <w:top w:val="single" w:sz="4" w:space="0" w:color="000000" w:themeColor="text1"/>
+              <w:left w:val="single" w:sz="4" w:space="0" w:color="000000" w:themeColor="text1"/>
+              <w:bottom w:val="single" w:sz="4" w:space="0" w:color="000000" w:themeColor="text1"/>
+              <w:right w:val="single" w:sz="4" w:space="0" w:color="000000" w:themeColor="text1"/>
             </w:tcBorders>
           </w:tcPr>
           <w:p>
@@ -3912,7 +3879,7 @@
               <w:ind w:left="187" w:right="342" w:firstLine="523"/>
               <w:jc w:val="both"/>
               <w:rPr>
-                <w:rFonts w:ascii="Arial" w:hAnsi="Arial" w:cs="Arial"/>
+                <w:rFonts w:ascii="Arial" w:eastAsia="Arial" w:hAnsi="Arial" w:cs="Arial"/>
               </w:rPr>
             </w:pPr>
             <w:r>
@@ -3926,6 +3893,9 @@
                 <w:rFonts w:ascii="Arial" w:hAnsi="Arial" w:cs="Arial"/>
               </w:rPr>
               <w:t xml:space="preserve"> criar uma jogabilidade baseada em ação indireta e estratégia que proporciona uma experiência imersiva, na qual o jogador interage com um cenário dinâmico e responsivo.</w:t>
+            </w:r>
+            <w:r>
+              <w:t xml:space="preserve"> </w:t>
             </w:r>
           </w:p>
           <w:p>
@@ -3935,7 +3905,69 @@
               <w:ind w:left="187" w:right="342" w:firstLine="523"/>
               <w:jc w:val="both"/>
               <w:rPr>
-                <w:rFonts w:ascii="Arial" w:hAnsi="Arial" w:cs="Arial"/>
+                <w:rFonts w:ascii="Arial" w:eastAsia="Arial" w:hAnsi="Arial" w:cs="Arial"/>
+              </w:rPr>
+            </w:pPr>
+            <w:r>
+              <w:rPr>
+                <w:rFonts w:ascii="Arial" w:eastAsia="Arial" w:hAnsi="Arial" w:cs="Arial"/>
+              </w:rPr>
+              <w:t xml:space="preserve">Além do entretenimento, o jogo </w:t>
+            </w:r>
+            <w:r>
+              <w:rPr>
+                <w:rFonts w:ascii="Arial" w:eastAsia="Arial" w:hAnsi="Arial" w:cs="Arial"/>
+                <w:i/>
+                <w:iCs/>
+              </w:rPr>
+              <w:t>Urban Chase</w:t>
+            </w:r>
+            <w:r>
+              <w:rPr>
+                <w:rFonts w:ascii="Arial" w:eastAsia="Arial" w:hAnsi="Arial" w:cs="Arial"/>
+              </w:rPr>
+              <w:t xml:space="preserve"> busca alinhar-se aos princípios ESG (Environmental, Social and Governance) e aos Objetivos de Desenvolvimento Sustentável (ODS) da ONU, especialmente no incentivo à conscientização social, à tomada de decisões responsáveis e à valorização de ambientes urbanos mais sustentáveis e inclusivos. Dessa forma, o projeto contribui para os ODS 11 </w:t>
+            </w:r>
+            <w:r>
+              <w:rPr>
+                <w:rFonts w:ascii="Arial" w:eastAsia="Arial" w:hAnsi="Arial" w:cs="Arial"/>
+              </w:rPr>
+              <w:t>(Cidades</w:t>
+            </w:r>
+            <w:r>
+              <w:rPr>
+                <w:rFonts w:ascii="Arial" w:eastAsia="Arial" w:hAnsi="Arial" w:cs="Arial"/>
+              </w:rPr>
+              <w:t xml:space="preserve"> e Comunidades Sustentáveis), ao estimular reflexões sobre a integridade do ambiente </w:t>
+            </w:r>
+            <w:r>
+              <w:rPr>
+                <w:rFonts w:ascii="Arial" w:eastAsia="Arial" w:hAnsi="Arial" w:cs="Arial"/>
+              </w:rPr>
+              <w:t>urbano e</w:t>
+            </w:r>
+            <w:r>
+              <w:rPr>
+                <w:rFonts w:ascii="Arial" w:eastAsia="Arial" w:hAnsi="Arial" w:cs="Arial"/>
+              </w:rPr>
+              <w:t xml:space="preserve"> ODS 9 (Indústria, Inovação </w:t>
+            </w:r>
+            <w:r>
+              <w:rPr>
+                <w:rFonts w:ascii="Arial" w:eastAsia="Arial" w:hAnsi="Arial" w:cs="Arial"/>
+              </w:rPr>
+              <w:lastRenderedPageBreak/>
+              <w:t>e Infraestrutura, ao utilizar a tecnologia e o game design como ferramentas de inovação e impacto social positivo.</w:t>
+            </w:r>
+          </w:p>
+          <w:p>
+            <w:pPr>
+              <w:pStyle w:val="NormalWeb"/>
+              <w:spacing w:before="0" w:beforeAutospacing="0" w:after="0" w:afterAutospacing="0" w:line="360" w:lineRule="auto"/>
+              <w:ind w:left="187" w:right="342" w:firstLine="523"/>
+              <w:jc w:val="both"/>
+              <w:rPr>
+                <w:rFonts w:ascii="Arial" w:eastAsia="Arial" w:hAnsi="Arial" w:cs="Arial"/>
               </w:rPr>
             </w:pPr>
           </w:p>
@@ -3970,54 +4002,6 @@
         <w:jc w:val="both"/>
         <w:rPr>
           <w:rFonts w:ascii="Arial" w:eastAsia="Arial" w:hAnsi="Arial" w:cs="Arial"/>
-          <w:sz w:val="24"/>
-          <w:szCs w:val="24"/>
-        </w:rPr>
-      </w:pPr>
-    </w:p>
-    <w:p>
-      <w:pPr>
-        <w:spacing w:after="0" w:line="360" w:lineRule="auto"/>
-        <w:jc w:val="both"/>
-        <w:rPr>
-          <w:rFonts w:ascii="Arial" w:eastAsia="Arial" w:hAnsi="Arial" w:cs="Arial"/>
-          <w:b/>
-          <w:sz w:val="24"/>
-          <w:szCs w:val="24"/>
-        </w:rPr>
-      </w:pPr>
-    </w:p>
-    <w:p>
-      <w:pPr>
-        <w:spacing w:after="0" w:line="360" w:lineRule="auto"/>
-        <w:jc w:val="both"/>
-        <w:rPr>
-          <w:rFonts w:ascii="Arial" w:eastAsia="Arial" w:hAnsi="Arial" w:cs="Arial"/>
-          <w:b/>
-          <w:sz w:val="24"/>
-          <w:szCs w:val="24"/>
-        </w:rPr>
-      </w:pPr>
-    </w:p>
-    <w:p>
-      <w:pPr>
-        <w:spacing w:after="0" w:line="360" w:lineRule="auto"/>
-        <w:jc w:val="both"/>
-        <w:rPr>
-          <w:rFonts w:ascii="Arial" w:eastAsia="Arial" w:hAnsi="Arial" w:cs="Arial"/>
-          <w:b/>
-          <w:sz w:val="24"/>
-          <w:szCs w:val="24"/>
-        </w:rPr>
-      </w:pPr>
-    </w:p>
-    <w:p>
-      <w:pPr>
-        <w:spacing w:after="0" w:line="360" w:lineRule="auto"/>
-        <w:jc w:val="both"/>
-        <w:rPr>
-          <w:rFonts w:ascii="Arial" w:eastAsia="Arial" w:hAnsi="Arial" w:cs="Arial"/>
-          <w:b/>
           <w:sz w:val="24"/>
           <w:szCs w:val="24"/>
         </w:rPr>
@@ -5175,66 +5159,6 @@
           <w:szCs w:val="24"/>
         </w:rPr>
       </w:pPr>
-    </w:p>
-    <w:p>
-      <w:pPr>
-        <w:spacing w:after="0" w:line="360" w:lineRule="auto"/>
-        <w:jc w:val="both"/>
-        <w:rPr>
-          <w:rFonts w:ascii="Arial" w:eastAsia="Arial" w:hAnsi="Arial" w:cs="Arial"/>
-          <w:b/>
-          <w:sz w:val="24"/>
-          <w:szCs w:val="24"/>
-        </w:rPr>
-      </w:pPr>
-    </w:p>
-    <w:p>
-      <w:pPr>
-        <w:spacing w:after="0" w:line="360" w:lineRule="auto"/>
-        <w:jc w:val="both"/>
-        <w:rPr>
-          <w:rFonts w:ascii="Arial" w:eastAsia="Arial" w:hAnsi="Arial" w:cs="Arial"/>
-          <w:b/>
-          <w:sz w:val="24"/>
-          <w:szCs w:val="24"/>
-        </w:rPr>
-      </w:pPr>
-    </w:p>
-    <w:p>
-      <w:pPr>
-        <w:spacing w:after="0" w:line="360" w:lineRule="auto"/>
-        <w:jc w:val="both"/>
-        <w:rPr>
-          <w:rFonts w:ascii="Arial" w:eastAsia="Arial" w:hAnsi="Arial" w:cs="Arial"/>
-          <w:b/>
-          <w:sz w:val="24"/>
-          <w:szCs w:val="24"/>
-        </w:rPr>
-      </w:pPr>
-    </w:p>
-    <w:p>
-      <w:pPr>
-        <w:spacing w:after="0" w:line="360" w:lineRule="auto"/>
-        <w:jc w:val="both"/>
-        <w:rPr>
-          <w:rFonts w:ascii="Arial" w:eastAsia="Arial" w:hAnsi="Arial" w:cs="Arial"/>
-          <w:b/>
-          <w:sz w:val="24"/>
-          <w:szCs w:val="24"/>
-        </w:rPr>
-      </w:pPr>
-    </w:p>
-    <w:p>
-      <w:pPr>
-        <w:spacing w:after="0" w:line="360" w:lineRule="auto"/>
-        <w:jc w:val="both"/>
-        <w:rPr>
-          <w:rFonts w:ascii="Arial" w:eastAsia="Arial" w:hAnsi="Arial" w:cs="Arial"/>
-          <w:b/>
-          <w:sz w:val="24"/>
-          <w:szCs w:val="24"/>
-        </w:rPr>
-      </w:pPr>
       <w:r>
         <w:rPr>
           <w:rFonts w:ascii="Arial" w:eastAsia="Arial" w:hAnsi="Arial" w:cs="Arial"/>
@@ -5242,6 +5166,7 @@
           <w:sz w:val="24"/>
           <w:szCs w:val="24"/>
         </w:rPr>
+        <w:lastRenderedPageBreak/>
         <w:t xml:space="preserve">Referências </w:t>
       </w:r>
     </w:p>
@@ -5976,6 +5901,7 @@
               <w:rPr>
                 <w:rFonts w:ascii="Arial" w:hAnsi="Arial" w:cs="Arial"/>
               </w:rPr>
+              <w:lastRenderedPageBreak/>
               <w:t xml:space="preserve">SILICON &amp; SYNAPSE. </w:t>
             </w:r>
             <w:r>
@@ -6376,6 +6302,7 @@
         <w:docPartUnique/>
       </w:docPartObj>
     </w:sdtPr>
+    <w:sdtEndPr/>
     <w:sdtContent>
       <w:p>
         <w:pPr>
@@ -7900,6 +7827,7 @@
   <w:style w:type="character" w:default="1" w:styleId="Fontepargpadro">
     <w:name w:val="Default Paragraph Font"/>
     <w:uiPriority w:val="1"/>
+    <w:semiHidden/>
     <w:unhideWhenUsed/>
   </w:style>
   <w:style w:type="table" w:default="1" w:styleId="Tabelanormal">
@@ -8644,20 +8572,20 @@
 </file>
 
 <file path=customXml/item1.xml><?xml version="1.0" encoding="utf-8"?>
+<p:properties xmlns:p="http://schemas.microsoft.com/office/2006/metadata/properties" xmlns:xsi="http://www.w3.org/2001/XMLSchema-instance" xmlns:pc="http://schemas.microsoft.com/office/infopath/2007/PartnerControls">
+  <documentManagement>
+    <_activity xmlns="cad2fdee-5bc2-4e59-8f6d-8fb6c4a72a29" xsi:nil="true"/>
+  </documentManagement>
+</p:properties>
+</file>
+
+<file path=customXml/item2.xml><?xml version="1.0" encoding="utf-8"?>
 <?mso-contentType ?>
 <FormTemplates xmlns="http://schemas.microsoft.com/sharepoint/v3/contenttype/forms">
   <Display>DocumentLibraryForm</Display>
   <Edit>DocumentLibraryForm</Edit>
   <New>DocumentLibraryForm</New>
 </FormTemplates>
-</file>
-
-<file path=customXml/item2.xml><?xml version="1.0" encoding="utf-8"?>
-<p:properties xmlns:p="http://schemas.microsoft.com/office/2006/metadata/properties" xmlns:xsi="http://www.w3.org/2001/XMLSchema-instance" xmlns:pc="http://schemas.microsoft.com/office/infopath/2007/PartnerControls">
-  <documentManagement>
-    <_activity xmlns="cad2fdee-5bc2-4e59-8f6d-8fb6c4a72a29" xsi:nil="true"/>
-  </documentManagement>
-</p:properties>
 </file>
 
 <file path=customXml/item3.xml><?xml version="1.0" encoding="utf-8"?>
@@ -8811,25 +8739,25 @@
 </file>
 
 <file path=customXml/itemProps1.xml><?xml version="1.0" encoding="utf-8"?>
-<ds:datastoreItem xmlns:ds="http://schemas.openxmlformats.org/officeDocument/2006/customXml" ds:itemID="{48DFB5F4-52F4-4628-91A3-77FC7DBF31CA}">
+<ds:datastoreItem xmlns:ds="http://schemas.openxmlformats.org/officeDocument/2006/customXml" ds:itemID="{F4C3DEEC-2600-444B-9739-BAA4A738EA1E}">
   <ds:schemaRefs>
-    <ds:schemaRef ds:uri="http://schemas.microsoft.com/sharepoint/v3/contenttype/forms"/>
+    <ds:schemaRef ds:uri="http://purl.org/dc/elements/1.1/"/>
+    <ds:schemaRef ds:uri="cad2fdee-5bc2-4e59-8f6d-8fb6c4a72a29"/>
+    <ds:schemaRef ds:uri="http://schemas.microsoft.com/office/2006/metadata/properties"/>
+    <ds:schemaRef ds:uri="http://schemas.microsoft.com/office/2006/documentManagement/types"/>
+    <ds:schemaRef ds:uri="http://schemas.openxmlformats.org/package/2006/metadata/core-properties"/>
+    <ds:schemaRef ds:uri="http://purl.org/dc/terms/"/>
+    <ds:schemaRef ds:uri="http://www.w3.org/XML/1998/namespace"/>
+    <ds:schemaRef ds:uri="http://schemas.microsoft.com/office/infopath/2007/PartnerControls"/>
+    <ds:schemaRef ds:uri="http://purl.org/dc/dcmitype/"/>
   </ds:schemaRefs>
 </ds:datastoreItem>
 </file>
 
 <file path=customXml/itemProps2.xml><?xml version="1.0" encoding="utf-8"?>
-<ds:datastoreItem xmlns:ds="http://schemas.openxmlformats.org/officeDocument/2006/customXml" ds:itemID="{F4C3DEEC-2600-444B-9739-BAA4A738EA1E}">
+<ds:datastoreItem xmlns:ds="http://schemas.openxmlformats.org/officeDocument/2006/customXml" ds:itemID="{48DFB5F4-52F4-4628-91A3-77FC7DBF31CA}">
   <ds:schemaRefs>
-    <ds:schemaRef ds:uri="http://purl.org/dc/elements/1.1/"/>
-    <ds:schemaRef ds:uri="cad2fdee-5bc2-4e59-8f6d-8fb6c4a72a29"/>
-    <ds:schemaRef ds:uri="http://purl.org/dc/terms/"/>
-    <ds:schemaRef ds:uri="http://schemas.microsoft.com/office/infopath/2007/PartnerControls"/>
-    <ds:schemaRef ds:uri="http://purl.org/dc/dcmitype/"/>
-    <ds:schemaRef ds:uri="http://schemas.openxmlformats.org/package/2006/metadata/core-properties"/>
-    <ds:schemaRef ds:uri="http://schemas.microsoft.com/office/2006/metadata/properties"/>
-    <ds:schemaRef ds:uri="http://schemas.microsoft.com/office/2006/documentManagement/types"/>
-    <ds:schemaRef ds:uri="http://www.w3.org/XML/1998/namespace"/>
+    <ds:schemaRef ds:uri="http://schemas.microsoft.com/sharepoint/v3/contenttype/forms"/>
   </ds:schemaRefs>
 </ds:datastoreItem>
 </file>

</xml_diff>